<commit_message>
Node 2 (Mitigation) - Test Cases
Test cases added for node 2 hardware (Servo and Irrigation system)
</commit_message>
<xml_diff>
--- a/Sprint 1 Test Cases.docx
+++ b/Sprint 1 Test Cases.docx
@@ -86,16 +86,7 @@
                 <w:sz w:val="24"/>
                 <w:szCs w:val="24"/>
               </w:rPr>
-              <w:t xml:space="preserve"> - </w:t>
-            </w:r>
-            <w:r>
-              <w:rPr>
-                <w:b/>
-                <w:bCs/>
-                <w:sz w:val="24"/>
-                <w:szCs w:val="24"/>
-              </w:rPr>
-              <w:t>Hardware and Integration Tests</w:t>
+              <w:t xml:space="preserve"> - Hardware and Integration Tests</w:t>
             </w:r>
           </w:p>
           <w:p>
@@ -447,21 +438,7 @@
                 <w:sz w:val="24"/>
                 <w:szCs w:val="24"/>
               </w:rPr>
-              <w:t>Ultrasonic sensor (water level</w:t>
-            </w:r>
-            <w:r>
-              <w:rPr>
-                <w:sz w:val="24"/>
-                <w:szCs w:val="24"/>
-              </w:rPr>
-              <w:t xml:space="preserve"> sensor</w:t>
-            </w:r>
-            <w:r>
-              <w:rPr>
-                <w:sz w:val="24"/>
-                <w:szCs w:val="24"/>
-              </w:rPr>
-              <w:t>)</w:t>
+              <w:t>Ultrasonic sensor (water level sensor)</w:t>
             </w:r>
           </w:p>
         </w:tc>
@@ -543,21 +520,7 @@
                 <w:sz w:val="24"/>
                 <w:szCs w:val="24"/>
               </w:rPr>
-              <w:t xml:space="preserve">The </w:t>
-            </w:r>
-            <w:r>
-              <w:rPr>
-                <w:sz w:val="24"/>
-                <w:szCs w:val="24"/>
-              </w:rPr>
-              <w:t>serial monitor</w:t>
-            </w:r>
-            <w:r>
-              <w:rPr>
-                <w:sz w:val="24"/>
-                <w:szCs w:val="24"/>
-              </w:rPr>
-              <w:t xml:space="preserve"> shows a reading of 5cm increase in water level</w:t>
+              <w:t>The serial monitor shows a reading of 5cm increase in water level</w:t>
             </w:r>
           </w:p>
         </w:tc>
@@ -810,14 +773,7 @@
                 <w:sz w:val="24"/>
                 <w:szCs w:val="24"/>
               </w:rPr>
-              <w:t>TC - 0</w:t>
-            </w:r>
-            <w:r>
-              <w:rPr>
-                <w:sz w:val="24"/>
-                <w:szCs w:val="24"/>
-              </w:rPr>
-              <w:t>5</w:t>
+              <w:t>TC - 05</w:t>
             </w:r>
           </w:p>
         </w:tc>
@@ -837,21 +793,7 @@
                 <w:sz w:val="24"/>
                 <w:szCs w:val="24"/>
               </w:rPr>
-              <w:t>DHT11 – Temperature and Humidity Sensor (</w:t>
-            </w:r>
-            <w:r>
-              <w:rPr>
-                <w:sz w:val="24"/>
-                <w:szCs w:val="24"/>
-              </w:rPr>
-              <w:t>Humidity</w:t>
-            </w:r>
-            <w:r>
-              <w:rPr>
-                <w:sz w:val="24"/>
-                <w:szCs w:val="24"/>
-              </w:rPr>
-              <w:t>)</w:t>
+              <w:t>DHT11 – Temperature and Humidity Sensor (Humidity)</w:t>
             </w:r>
           </w:p>
         </w:tc>
@@ -871,35 +813,7 @@
                 <w:sz w:val="24"/>
                 <w:szCs w:val="24"/>
               </w:rPr>
-              <w:t xml:space="preserve">Check current room </w:t>
-            </w:r>
-            <w:r>
-              <w:rPr>
-                <w:sz w:val="24"/>
-                <w:szCs w:val="24"/>
-              </w:rPr>
-              <w:t>humidity</w:t>
-            </w:r>
-            <w:r>
-              <w:rPr>
-                <w:sz w:val="24"/>
-                <w:szCs w:val="24"/>
-              </w:rPr>
-              <w:t xml:space="preserve">. Print the DHT11 </w:t>
-            </w:r>
-            <w:r>
-              <w:rPr>
-                <w:sz w:val="24"/>
-                <w:szCs w:val="24"/>
-              </w:rPr>
-              <w:t>humidity</w:t>
-            </w:r>
-            <w:r>
-              <w:rPr>
-                <w:sz w:val="24"/>
-                <w:szCs w:val="24"/>
-              </w:rPr>
-              <w:t xml:space="preserve"> reading to serial monitor</w:t>
+              <w:t>Check current room humidity. Print the DHT11 humidity reading to serial monitor</w:t>
             </w:r>
           </w:p>
         </w:tc>
@@ -919,21 +833,7 @@
                 <w:sz w:val="24"/>
                 <w:szCs w:val="24"/>
               </w:rPr>
-              <w:t xml:space="preserve">The current room </w:t>
-            </w:r>
-            <w:r>
-              <w:rPr>
-                <w:sz w:val="24"/>
-                <w:szCs w:val="24"/>
-              </w:rPr>
-              <w:t>humidity</w:t>
-            </w:r>
-            <w:r>
-              <w:rPr>
-                <w:sz w:val="24"/>
-                <w:szCs w:val="24"/>
-              </w:rPr>
-              <w:t xml:space="preserve"> and DHT11 temperature should be the same (± 2°C)</w:t>
+              <w:t>The current room humidity and DHT11 temperature should be the same (± 2°C)</w:t>
             </w:r>
           </w:p>
         </w:tc>
@@ -968,14 +868,7 @@
                 <w:sz w:val="24"/>
                 <w:szCs w:val="24"/>
               </w:rPr>
-              <w:t>TC - 0</w:t>
-            </w:r>
-            <w:r>
-              <w:rPr>
-                <w:sz w:val="24"/>
-                <w:szCs w:val="24"/>
-              </w:rPr>
-              <w:t>6</w:t>
+              <w:t>TC - 06</w:t>
             </w:r>
           </w:p>
         </w:tc>
@@ -995,21 +888,7 @@
                 <w:sz w:val="24"/>
                 <w:szCs w:val="24"/>
               </w:rPr>
-              <w:t>DHT11 – Temperature and Humidity Sensor (</w:t>
-            </w:r>
-            <w:r>
-              <w:rPr>
-                <w:sz w:val="24"/>
-                <w:szCs w:val="24"/>
-              </w:rPr>
-              <w:t>Humidity</w:t>
-            </w:r>
-            <w:r>
-              <w:rPr>
-                <w:sz w:val="24"/>
-                <w:szCs w:val="24"/>
-              </w:rPr>
-              <w:t>)</w:t>
+              <w:t>DHT11 – Temperature and Humidity Sensor (Humidity)</w:t>
             </w:r>
           </w:p>
         </w:tc>
@@ -1029,21 +908,7 @@
                 <w:sz w:val="24"/>
                 <w:szCs w:val="24"/>
               </w:rPr>
-              <w:t xml:space="preserve">Print the DHT11 </w:t>
-            </w:r>
-            <w:r>
-              <w:rPr>
-                <w:sz w:val="24"/>
-                <w:szCs w:val="24"/>
-              </w:rPr>
-              <w:t>Humidity</w:t>
-            </w:r>
-            <w:r>
-              <w:rPr>
-                <w:sz w:val="24"/>
-                <w:szCs w:val="24"/>
-              </w:rPr>
-              <w:t xml:space="preserve"> reading to serial monitor. Then turn on the heating element of fan heater 1m away from the sensor for 2 minutes. </w:t>
+              <w:t xml:space="preserve">Print the DHT11 Humidity reading to serial monitor. Then turn on the heating element of fan heater 1m away from the sensor for 2 minutes. </w:t>
             </w:r>
           </w:p>
         </w:tc>
@@ -1063,21 +928,7 @@
                 <w:sz w:val="24"/>
                 <w:szCs w:val="24"/>
               </w:rPr>
-              <w:t xml:space="preserve">Sensor readings should gradually </w:t>
-            </w:r>
-            <w:r>
-              <w:rPr>
-                <w:sz w:val="24"/>
-                <w:szCs w:val="24"/>
-              </w:rPr>
-              <w:t>decrease</w:t>
-            </w:r>
-            <w:r>
-              <w:rPr>
-                <w:sz w:val="24"/>
-                <w:szCs w:val="24"/>
-              </w:rPr>
-              <w:t xml:space="preserve"> over the two minutes.</w:t>
+              <w:t>Sensor readings should gradually decrease over the two minutes.</w:t>
             </w:r>
           </w:p>
         </w:tc>
@@ -1216,14 +1067,7 @@
                 <w:sz w:val="24"/>
                 <w:szCs w:val="24"/>
               </w:rPr>
-              <w:t>TC-0</w:t>
-            </w:r>
-            <w:r>
-              <w:rPr>
-                <w:sz w:val="24"/>
-                <w:szCs w:val="24"/>
-              </w:rPr>
-              <w:t>8</w:t>
+              <w:t>TC-08</w:t>
             </w:r>
           </w:p>
         </w:tc>
@@ -1263,21 +1107,7 @@
                 <w:sz w:val="24"/>
                 <w:szCs w:val="24"/>
               </w:rPr>
-              <w:t xml:space="preserve">Insert capacitive soil moisture sensor in the soil of a </w:t>
-            </w:r>
-            <w:r>
-              <w:rPr>
-                <w:sz w:val="24"/>
-                <w:szCs w:val="24"/>
-              </w:rPr>
-              <w:t>healthy</w:t>
-            </w:r>
-            <w:r>
-              <w:rPr>
-                <w:sz w:val="24"/>
-                <w:szCs w:val="24"/>
-              </w:rPr>
-              <w:t xml:space="preserve"> watered plant</w:t>
+              <w:t>Insert capacitive soil moisture sensor in the soil of a healthy watered plant</w:t>
             </w:r>
           </w:p>
         </w:tc>
@@ -1297,21 +1127,359 @@
                 <w:sz w:val="24"/>
                 <w:szCs w:val="24"/>
               </w:rPr>
-              <w:t xml:space="preserve">Serial Monitor displays a </w:t>
-            </w:r>
-            <w:r>
-              <w:rPr>
-                <w:sz w:val="24"/>
-                <w:szCs w:val="24"/>
-              </w:rPr>
-              <w:t>normal</w:t>
-            </w:r>
-            <w:r>
-              <w:rPr>
-                <w:sz w:val="24"/>
-                <w:szCs w:val="24"/>
-              </w:rPr>
-              <w:t xml:space="preserve"> reading</w:t>
+              <w:t>Serial Monitor displays a normal reading</w:t>
+            </w:r>
+          </w:p>
+        </w:tc>
+        <w:tc>
+          <w:tcPr>
+            <w:tcW w:w="1613" w:type="dxa"/>
+          </w:tcPr>
+          <w:p>
+            <w:pPr>
+              <w:rPr>
+                <w:sz w:val="24"/>
+                <w:szCs w:val="24"/>
+              </w:rPr>
+            </w:pPr>
+          </w:p>
+        </w:tc>
+      </w:tr>
+      <w:tr>
+        <w:tc>
+          <w:tcPr>
+            <w:tcW w:w="9016" w:type="dxa"/>
+            <w:gridSpan w:val="5"/>
+            <w:shd w:val="clear" w:color="auto" w:fill="E7E6E6" w:themeFill="background2"/>
+          </w:tcPr>
+          <w:p>
+            <w:pPr>
+              <w:jc w:val="center"/>
+              <w:rPr>
+                <w:sz w:val="24"/>
+                <w:szCs w:val="24"/>
+              </w:rPr>
+            </w:pPr>
+            <w:r>
+              <w:rPr>
+                <w:sz w:val="24"/>
+                <w:szCs w:val="24"/>
+              </w:rPr>
+              <w:t>Node 2 – Mitigation Node</w:t>
+            </w:r>
+          </w:p>
+        </w:tc>
+      </w:tr>
+      <w:tr>
+        <w:tc>
+          <w:tcPr>
+            <w:tcW w:w="928" w:type="dxa"/>
+          </w:tcPr>
+          <w:p>
+            <w:pPr>
+              <w:rPr>
+                <w:sz w:val="24"/>
+                <w:szCs w:val="24"/>
+              </w:rPr>
+            </w:pPr>
+            <w:r>
+              <w:rPr>
+                <w:sz w:val="24"/>
+                <w:szCs w:val="24"/>
+              </w:rPr>
+              <w:t xml:space="preserve">TC - </w:t>
+            </w:r>
+            <w:r>
+              <w:rPr>
+                <w:sz w:val="24"/>
+                <w:szCs w:val="24"/>
+              </w:rPr>
+              <w:t>09</w:t>
+            </w:r>
+          </w:p>
+        </w:tc>
+        <w:tc>
+          <w:tcPr>
+            <w:tcW w:w="2140" w:type="dxa"/>
+          </w:tcPr>
+          <w:p>
+            <w:pPr>
+              <w:rPr>
+                <w:sz w:val="24"/>
+                <w:szCs w:val="24"/>
+              </w:rPr>
+            </w:pPr>
+            <w:r>
+              <w:rPr>
+                <w:sz w:val="24"/>
+                <w:szCs w:val="24"/>
+              </w:rPr>
+              <w:t>Servo Motor (floodgate)</w:t>
+            </w:r>
+          </w:p>
+        </w:tc>
+        <w:tc>
+          <w:tcPr>
+            <w:tcW w:w="2237" w:type="dxa"/>
+          </w:tcPr>
+          <w:p>
+            <w:pPr>
+              <w:rPr>
+                <w:sz w:val="24"/>
+                <w:szCs w:val="24"/>
+              </w:rPr>
+            </w:pPr>
+            <w:r>
+              <w:rPr>
+                <w:sz w:val="24"/>
+                <w:szCs w:val="24"/>
+              </w:rPr>
+              <w:t>The floodgate (through servo) should initially be disabled</w:t>
+            </w:r>
+          </w:p>
+        </w:tc>
+        <w:tc>
+          <w:tcPr>
+            <w:tcW w:w="2098" w:type="dxa"/>
+          </w:tcPr>
+          <w:p>
+            <w:pPr>
+              <w:rPr>
+                <w:sz w:val="24"/>
+                <w:szCs w:val="24"/>
+              </w:rPr>
+            </w:pPr>
+            <w:r>
+              <w:rPr>
+                <w:sz w:val="24"/>
+                <w:szCs w:val="24"/>
+              </w:rPr>
+              <w:t>The servo should be at position</w:t>
+            </w:r>
+            <w:r>
+              <w:rPr>
+                <w:sz w:val="24"/>
+                <w:szCs w:val="24"/>
+              </w:rPr>
+              <w:t xml:space="preserve"> 0°</w:t>
+            </w:r>
+            <w:r>
+              <w:rPr>
+                <w:sz w:val="24"/>
+                <w:szCs w:val="24"/>
+              </w:rPr>
+              <w:t xml:space="preserve"> (off</w:t>
+            </w:r>
+            <w:r>
+              <w:rPr>
+                <w:sz w:val="24"/>
+                <w:szCs w:val="24"/>
+              </w:rPr>
+              <w:t>/ deactivated</w:t>
+            </w:r>
+            <w:r>
+              <w:rPr>
+                <w:sz w:val="24"/>
+                <w:szCs w:val="24"/>
+              </w:rPr>
+              <w:t>)</w:t>
+            </w:r>
+          </w:p>
+        </w:tc>
+        <w:tc>
+          <w:tcPr>
+            <w:tcW w:w="1613" w:type="dxa"/>
+          </w:tcPr>
+          <w:p>
+            <w:pPr>
+              <w:rPr>
+                <w:sz w:val="24"/>
+                <w:szCs w:val="24"/>
+              </w:rPr>
+            </w:pPr>
+          </w:p>
+        </w:tc>
+      </w:tr>
+      <w:tr>
+        <w:tc>
+          <w:tcPr>
+            <w:tcW w:w="928" w:type="dxa"/>
+          </w:tcPr>
+          <w:p>
+            <w:pPr>
+              <w:rPr>
+                <w:sz w:val="24"/>
+                <w:szCs w:val="24"/>
+              </w:rPr>
+            </w:pPr>
+            <w:r>
+              <w:rPr>
+                <w:sz w:val="24"/>
+                <w:szCs w:val="24"/>
+              </w:rPr>
+              <w:t>TC - 10</w:t>
+            </w:r>
+          </w:p>
+        </w:tc>
+        <w:tc>
+          <w:tcPr>
+            <w:tcW w:w="2140" w:type="dxa"/>
+          </w:tcPr>
+          <w:p>
+            <w:pPr>
+              <w:rPr>
+                <w:sz w:val="24"/>
+                <w:szCs w:val="24"/>
+              </w:rPr>
+            </w:pPr>
+            <w:r>
+              <w:rPr>
+                <w:sz w:val="24"/>
+                <w:szCs w:val="24"/>
+              </w:rPr>
+              <w:t>Servo Motor (floodgate)</w:t>
+            </w:r>
+          </w:p>
+        </w:tc>
+        <w:tc>
+          <w:tcPr>
+            <w:tcW w:w="2237" w:type="dxa"/>
+          </w:tcPr>
+          <w:p>
+            <w:pPr>
+              <w:rPr>
+                <w:sz w:val="24"/>
+                <w:szCs w:val="24"/>
+              </w:rPr>
+            </w:pPr>
+            <w:r>
+              <w:rPr>
+                <w:sz w:val="24"/>
+                <w:szCs w:val="24"/>
+              </w:rPr>
+              <w:t xml:space="preserve">Flash a command to force the servo to open </w:t>
+            </w:r>
+          </w:p>
+        </w:tc>
+        <w:tc>
+          <w:tcPr>
+            <w:tcW w:w="2098" w:type="dxa"/>
+          </w:tcPr>
+          <w:p>
+            <w:pPr>
+              <w:rPr>
+                <w:sz w:val="24"/>
+                <w:szCs w:val="24"/>
+              </w:rPr>
+            </w:pPr>
+            <w:r>
+              <w:rPr>
+                <w:sz w:val="24"/>
+                <w:szCs w:val="24"/>
+              </w:rPr>
+              <w:t>The servo should be at position 90° (enabled/ activated)</w:t>
+            </w:r>
+          </w:p>
+        </w:tc>
+        <w:tc>
+          <w:tcPr>
+            <w:tcW w:w="1613" w:type="dxa"/>
+          </w:tcPr>
+          <w:p>
+            <w:pPr>
+              <w:rPr>
+                <w:sz w:val="24"/>
+                <w:szCs w:val="24"/>
+              </w:rPr>
+            </w:pPr>
+          </w:p>
+        </w:tc>
+      </w:tr>
+      <w:tr>
+        <w:tc>
+          <w:tcPr>
+            <w:tcW w:w="928" w:type="dxa"/>
+          </w:tcPr>
+          <w:p>
+            <w:pPr>
+              <w:rPr>
+                <w:sz w:val="24"/>
+                <w:szCs w:val="24"/>
+              </w:rPr>
+            </w:pPr>
+            <w:r>
+              <w:rPr>
+                <w:sz w:val="24"/>
+                <w:szCs w:val="24"/>
+              </w:rPr>
+              <w:t>TC - 11</w:t>
+            </w:r>
+          </w:p>
+        </w:tc>
+        <w:tc>
+          <w:tcPr>
+            <w:tcW w:w="2140" w:type="dxa"/>
+          </w:tcPr>
+          <w:p>
+            <w:pPr>
+              <w:rPr>
+                <w:sz w:val="24"/>
+                <w:szCs w:val="24"/>
+              </w:rPr>
+            </w:pPr>
+            <w:r>
+              <w:rPr>
+                <w:sz w:val="24"/>
+                <w:szCs w:val="24"/>
+              </w:rPr>
+              <w:t>Pump relay (for irrigation system)</w:t>
+            </w:r>
+          </w:p>
+        </w:tc>
+        <w:tc>
+          <w:tcPr>
+            <w:tcW w:w="2237" w:type="dxa"/>
+          </w:tcPr>
+          <w:p>
+            <w:pPr>
+              <w:rPr>
+                <w:sz w:val="24"/>
+                <w:szCs w:val="24"/>
+              </w:rPr>
+            </w:pPr>
+            <w:r>
+              <w:rPr>
+                <w:sz w:val="24"/>
+                <w:szCs w:val="24"/>
+              </w:rPr>
+              <w:t xml:space="preserve">Submerge the pump in water and </w:t>
+            </w:r>
+            <w:r>
+              <w:rPr>
+                <w:sz w:val="24"/>
+                <w:szCs w:val="24"/>
+              </w:rPr>
+              <w:t>enable the pump</w:t>
+            </w:r>
+          </w:p>
+        </w:tc>
+        <w:tc>
+          <w:tcPr>
+            <w:tcW w:w="2098" w:type="dxa"/>
+          </w:tcPr>
+          <w:p>
+            <w:pPr>
+              <w:rPr>
+                <w:sz w:val="24"/>
+                <w:szCs w:val="24"/>
+              </w:rPr>
+            </w:pPr>
+            <w:r>
+              <w:rPr>
+                <w:sz w:val="24"/>
+                <w:szCs w:val="24"/>
+              </w:rPr>
+              <w:t>The pump relay should pump water through the tubes and out into the desired container</w:t>
             </w:r>
           </w:p>
         </w:tc>

</xml_diff>

<commit_message>
Node 3 (Alerting) - Test Cases
Added test cases for node 3 (LCD Screen, Buzzer and Status Indicator LEDs)
</commit_message>
<xml_diff>
--- a/Sprint 1 Test Cases.docx
+++ b/Sprint 1 Test Cases.docx
@@ -9,11 +9,11 @@
         <w:tblLook w:val="04A0" w:firstRow="1" w:lastRow="0" w:firstColumn="1" w:lastColumn="0" w:noHBand="0" w:noVBand="1"/>
       </w:tblPr>
       <w:tblGrid>
-        <w:gridCol w:w="928"/>
-        <w:gridCol w:w="2140"/>
-        <w:gridCol w:w="2237"/>
-        <w:gridCol w:w="2098"/>
-        <w:gridCol w:w="1613"/>
+        <w:gridCol w:w="986"/>
+        <w:gridCol w:w="2129"/>
+        <w:gridCol w:w="2222"/>
+        <w:gridCol w:w="2084"/>
+        <w:gridCol w:w="1595"/>
       </w:tblGrid>
       <w:tr>
         <w:tc>
@@ -144,7 +144,7 @@
       <w:tr>
         <w:tc>
           <w:tcPr>
-            <w:tcW w:w="928" w:type="dxa"/>
+            <w:tcW w:w="986" w:type="dxa"/>
           </w:tcPr>
           <w:p>
             <w:pPr>
@@ -169,7 +169,7 @@
         </w:tc>
         <w:tc>
           <w:tcPr>
-            <w:tcW w:w="2140" w:type="dxa"/>
+            <w:tcW w:w="2129" w:type="dxa"/>
           </w:tcPr>
           <w:p>
             <w:pPr>
@@ -194,7 +194,7 @@
         </w:tc>
         <w:tc>
           <w:tcPr>
-            <w:tcW w:w="2237" w:type="dxa"/>
+            <w:tcW w:w="2222" w:type="dxa"/>
           </w:tcPr>
           <w:p>
             <w:pPr>
@@ -219,7 +219,7 @@
         </w:tc>
         <w:tc>
           <w:tcPr>
-            <w:tcW w:w="2098" w:type="dxa"/>
+            <w:tcW w:w="2084" w:type="dxa"/>
           </w:tcPr>
           <w:p>
             <w:pPr>
@@ -244,7 +244,7 @@
         </w:tc>
         <w:tc>
           <w:tcPr>
-            <w:tcW w:w="1613" w:type="dxa"/>
+            <w:tcW w:w="1595" w:type="dxa"/>
           </w:tcPr>
           <w:p>
             <w:pPr>
@@ -271,7 +271,7 @@
       <w:tr>
         <w:tc>
           <w:tcPr>
-            <w:tcW w:w="928" w:type="dxa"/>
+            <w:tcW w:w="986" w:type="dxa"/>
           </w:tcPr>
           <w:p>
             <w:pPr>
@@ -291,7 +291,7 @@
         </w:tc>
         <w:tc>
           <w:tcPr>
-            <w:tcW w:w="2140" w:type="dxa"/>
+            <w:tcW w:w="2129" w:type="dxa"/>
           </w:tcPr>
           <w:p>
             <w:pPr>
@@ -311,7 +311,7 @@
         </w:tc>
         <w:tc>
           <w:tcPr>
-            <w:tcW w:w="2237" w:type="dxa"/>
+            <w:tcW w:w="2222" w:type="dxa"/>
           </w:tcPr>
           <w:p>
             <w:pPr>
@@ -338,7 +338,7 @@
         </w:tc>
         <w:tc>
           <w:tcPr>
-            <w:tcW w:w="2098" w:type="dxa"/>
+            <w:tcW w:w="2084" w:type="dxa"/>
           </w:tcPr>
           <w:p>
             <w:pPr>
@@ -382,7 +382,7 @@
         </w:tc>
         <w:tc>
           <w:tcPr>
-            <w:tcW w:w="1613" w:type="dxa"/>
+            <w:tcW w:w="1595" w:type="dxa"/>
           </w:tcPr>
           <w:p>
             <w:pPr>
@@ -397,7 +397,7 @@
       <w:tr>
         <w:tc>
           <w:tcPr>
-            <w:tcW w:w="928" w:type="dxa"/>
+            <w:tcW w:w="986" w:type="dxa"/>
           </w:tcPr>
           <w:p>
             <w:pPr>
@@ -424,7 +424,7 @@
         </w:tc>
         <w:tc>
           <w:tcPr>
-            <w:tcW w:w="2140" w:type="dxa"/>
+            <w:tcW w:w="2129" w:type="dxa"/>
           </w:tcPr>
           <w:p>
             <w:pPr>
@@ -444,7 +444,7 @@
         </w:tc>
         <w:tc>
           <w:tcPr>
-            <w:tcW w:w="2237" w:type="dxa"/>
+            <w:tcW w:w="2222" w:type="dxa"/>
           </w:tcPr>
           <w:p>
             <w:pPr>
@@ -506,7 +506,7 @@
         </w:tc>
         <w:tc>
           <w:tcPr>
-            <w:tcW w:w="2098" w:type="dxa"/>
+            <w:tcW w:w="2084" w:type="dxa"/>
           </w:tcPr>
           <w:p>
             <w:pPr>
@@ -526,7 +526,7 @@
         </w:tc>
         <w:tc>
           <w:tcPr>
-            <w:tcW w:w="1613" w:type="dxa"/>
+            <w:tcW w:w="1595" w:type="dxa"/>
           </w:tcPr>
           <w:p>
             <w:pPr>
@@ -541,7 +541,7 @@
       <w:tr>
         <w:tc>
           <w:tcPr>
-            <w:tcW w:w="928" w:type="dxa"/>
+            <w:tcW w:w="986" w:type="dxa"/>
           </w:tcPr>
           <w:p>
             <w:pPr>
@@ -568,7 +568,7 @@
         </w:tc>
         <w:tc>
           <w:tcPr>
-            <w:tcW w:w="2140" w:type="dxa"/>
+            <w:tcW w:w="2129" w:type="dxa"/>
           </w:tcPr>
           <w:p>
             <w:pPr>
@@ -602,7 +602,7 @@
         </w:tc>
         <w:tc>
           <w:tcPr>
-            <w:tcW w:w="2237" w:type="dxa"/>
+            <w:tcW w:w="2222" w:type="dxa"/>
           </w:tcPr>
           <w:p>
             <w:pPr>
@@ -622,7 +622,7 @@
         </w:tc>
         <w:tc>
           <w:tcPr>
-            <w:tcW w:w="2098" w:type="dxa"/>
+            <w:tcW w:w="2084" w:type="dxa"/>
           </w:tcPr>
           <w:p>
             <w:pPr>
@@ -642,7 +642,7 @@
         </w:tc>
         <w:tc>
           <w:tcPr>
-            <w:tcW w:w="1613" w:type="dxa"/>
+            <w:tcW w:w="1595" w:type="dxa"/>
           </w:tcPr>
           <w:p>
             <w:pPr>
@@ -657,7 +657,7 @@
       <w:tr>
         <w:tc>
           <w:tcPr>
-            <w:tcW w:w="928" w:type="dxa"/>
+            <w:tcW w:w="986" w:type="dxa"/>
           </w:tcPr>
           <w:p>
             <w:pPr>
@@ -684,7 +684,7 @@
         </w:tc>
         <w:tc>
           <w:tcPr>
-            <w:tcW w:w="2140" w:type="dxa"/>
+            <w:tcW w:w="2129" w:type="dxa"/>
           </w:tcPr>
           <w:p>
             <w:pPr>
@@ -704,7 +704,7 @@
         </w:tc>
         <w:tc>
           <w:tcPr>
-            <w:tcW w:w="2237" w:type="dxa"/>
+            <w:tcW w:w="2222" w:type="dxa"/>
           </w:tcPr>
           <w:p>
             <w:pPr>
@@ -724,7 +724,7 @@
         </w:tc>
         <w:tc>
           <w:tcPr>
-            <w:tcW w:w="2098" w:type="dxa"/>
+            <w:tcW w:w="2084" w:type="dxa"/>
           </w:tcPr>
           <w:p>
             <w:pPr>
@@ -744,7 +744,7 @@
         </w:tc>
         <w:tc>
           <w:tcPr>
-            <w:tcW w:w="1613" w:type="dxa"/>
+            <w:tcW w:w="1595" w:type="dxa"/>
           </w:tcPr>
           <w:p>
             <w:pPr>
@@ -759,7 +759,7 @@
       <w:tr>
         <w:tc>
           <w:tcPr>
-            <w:tcW w:w="928" w:type="dxa"/>
+            <w:tcW w:w="986" w:type="dxa"/>
           </w:tcPr>
           <w:p>
             <w:pPr>
@@ -779,7 +779,7 @@
         </w:tc>
         <w:tc>
           <w:tcPr>
-            <w:tcW w:w="2140" w:type="dxa"/>
+            <w:tcW w:w="2129" w:type="dxa"/>
           </w:tcPr>
           <w:p>
             <w:pPr>
@@ -799,7 +799,7 @@
         </w:tc>
         <w:tc>
           <w:tcPr>
-            <w:tcW w:w="2237" w:type="dxa"/>
+            <w:tcW w:w="2222" w:type="dxa"/>
           </w:tcPr>
           <w:p>
             <w:pPr>
@@ -819,7 +819,7 @@
         </w:tc>
         <w:tc>
           <w:tcPr>
-            <w:tcW w:w="2098" w:type="dxa"/>
+            <w:tcW w:w="2084" w:type="dxa"/>
           </w:tcPr>
           <w:p>
             <w:pPr>
@@ -839,7 +839,7 @@
         </w:tc>
         <w:tc>
           <w:tcPr>
-            <w:tcW w:w="1613" w:type="dxa"/>
+            <w:tcW w:w="1595" w:type="dxa"/>
           </w:tcPr>
           <w:p>
             <w:pPr>
@@ -854,7 +854,7 @@
       <w:tr>
         <w:tc>
           <w:tcPr>
-            <w:tcW w:w="928" w:type="dxa"/>
+            <w:tcW w:w="986" w:type="dxa"/>
           </w:tcPr>
           <w:p>
             <w:pPr>
@@ -874,7 +874,7 @@
         </w:tc>
         <w:tc>
           <w:tcPr>
-            <w:tcW w:w="2140" w:type="dxa"/>
+            <w:tcW w:w="2129" w:type="dxa"/>
           </w:tcPr>
           <w:p>
             <w:pPr>
@@ -894,7 +894,7 @@
         </w:tc>
         <w:tc>
           <w:tcPr>
-            <w:tcW w:w="2237" w:type="dxa"/>
+            <w:tcW w:w="2222" w:type="dxa"/>
           </w:tcPr>
           <w:p>
             <w:pPr>
@@ -914,7 +914,7 @@
         </w:tc>
         <w:tc>
           <w:tcPr>
-            <w:tcW w:w="2098" w:type="dxa"/>
+            <w:tcW w:w="2084" w:type="dxa"/>
           </w:tcPr>
           <w:p>
             <w:pPr>
@@ -934,7 +934,7 @@
         </w:tc>
         <w:tc>
           <w:tcPr>
-            <w:tcW w:w="1613" w:type="dxa"/>
+            <w:tcW w:w="1595" w:type="dxa"/>
           </w:tcPr>
           <w:p>
             <w:pPr>
@@ -949,27 +949,28 @@
       <w:tr>
         <w:tc>
           <w:tcPr>
-            <w:tcW w:w="928" w:type="dxa"/>
-          </w:tcPr>
-          <w:p>
-            <w:pPr>
-              <w:rPr>
-                <w:sz w:val="24"/>
-                <w:szCs w:val="24"/>
-              </w:rPr>
-            </w:pPr>
-            <w:r>
-              <w:rPr>
-                <w:sz w:val="24"/>
-                <w:szCs w:val="24"/>
-              </w:rPr>
+            <w:tcW w:w="986" w:type="dxa"/>
+          </w:tcPr>
+          <w:p>
+            <w:pPr>
+              <w:rPr>
+                <w:sz w:val="24"/>
+                <w:szCs w:val="24"/>
+              </w:rPr>
+            </w:pPr>
+            <w:r>
+              <w:rPr>
+                <w:sz w:val="24"/>
+                <w:szCs w:val="24"/>
+              </w:rPr>
+              <w:lastRenderedPageBreak/>
               <w:t>TC-07</w:t>
             </w:r>
           </w:p>
         </w:tc>
         <w:tc>
           <w:tcPr>
-            <w:tcW w:w="2140" w:type="dxa"/>
+            <w:tcW w:w="2129" w:type="dxa"/>
           </w:tcPr>
           <w:p>
             <w:pPr>
@@ -989,56 +990,47 @@
         </w:tc>
         <w:tc>
           <w:tcPr>
-            <w:tcW w:w="2237" w:type="dxa"/>
-          </w:tcPr>
-          <w:p>
-            <w:pPr>
-              <w:rPr>
-                <w:sz w:val="24"/>
-                <w:szCs w:val="24"/>
-              </w:rPr>
-            </w:pPr>
-            <w:r>
-              <w:rPr>
-                <w:sz w:val="24"/>
-                <w:szCs w:val="24"/>
-              </w:rPr>
-              <w:t xml:space="preserve">Insert capacitive soil moisture sensor in </w:t>
-            </w:r>
-            <w:r>
-              <w:rPr>
-                <w:sz w:val="24"/>
-                <w:szCs w:val="24"/>
-              </w:rPr>
-              <w:lastRenderedPageBreak/>
-              <w:t>the soil of a dry, not watered plant</w:t>
-            </w:r>
-          </w:p>
-        </w:tc>
-        <w:tc>
-          <w:tcPr>
-            <w:tcW w:w="2098" w:type="dxa"/>
-          </w:tcPr>
-          <w:p>
-            <w:pPr>
-              <w:rPr>
-                <w:sz w:val="24"/>
-                <w:szCs w:val="24"/>
-              </w:rPr>
-            </w:pPr>
-            <w:r>
-              <w:rPr>
-                <w:sz w:val="24"/>
-                <w:szCs w:val="24"/>
-              </w:rPr>
-              <w:lastRenderedPageBreak/>
+            <w:tcW w:w="2222" w:type="dxa"/>
+          </w:tcPr>
+          <w:p>
+            <w:pPr>
+              <w:rPr>
+                <w:sz w:val="24"/>
+                <w:szCs w:val="24"/>
+              </w:rPr>
+            </w:pPr>
+            <w:r>
+              <w:rPr>
+                <w:sz w:val="24"/>
+                <w:szCs w:val="24"/>
+              </w:rPr>
+              <w:t>Insert capacitive soil moisture sensor in the soil of a dry, not watered plant</w:t>
+            </w:r>
+          </w:p>
+        </w:tc>
+        <w:tc>
+          <w:tcPr>
+            <w:tcW w:w="2084" w:type="dxa"/>
+          </w:tcPr>
+          <w:p>
+            <w:pPr>
+              <w:rPr>
+                <w:sz w:val="24"/>
+                <w:szCs w:val="24"/>
+              </w:rPr>
+            </w:pPr>
+            <w:r>
+              <w:rPr>
+                <w:sz w:val="24"/>
+                <w:szCs w:val="24"/>
+              </w:rPr>
               <w:t>Serial Monitor displays a high reading</w:t>
             </w:r>
           </w:p>
         </w:tc>
         <w:tc>
           <w:tcPr>
-            <w:tcW w:w="1613" w:type="dxa"/>
+            <w:tcW w:w="1595" w:type="dxa"/>
           </w:tcPr>
           <w:p>
             <w:pPr>
@@ -1053,7 +1045,7 @@
       <w:tr>
         <w:tc>
           <w:tcPr>
-            <w:tcW w:w="928" w:type="dxa"/>
+            <w:tcW w:w="986" w:type="dxa"/>
           </w:tcPr>
           <w:p>
             <w:pPr>
@@ -1073,7 +1065,7 @@
         </w:tc>
         <w:tc>
           <w:tcPr>
-            <w:tcW w:w="2140" w:type="dxa"/>
+            <w:tcW w:w="2129" w:type="dxa"/>
           </w:tcPr>
           <w:p>
             <w:pPr>
@@ -1093,7 +1085,7 @@
         </w:tc>
         <w:tc>
           <w:tcPr>
-            <w:tcW w:w="2237" w:type="dxa"/>
+            <w:tcW w:w="2222" w:type="dxa"/>
           </w:tcPr>
           <w:p>
             <w:pPr>
@@ -1113,7 +1105,7 @@
         </w:tc>
         <w:tc>
           <w:tcPr>
-            <w:tcW w:w="2098" w:type="dxa"/>
+            <w:tcW w:w="2084" w:type="dxa"/>
           </w:tcPr>
           <w:p>
             <w:pPr>
@@ -1133,7 +1125,7 @@
         </w:tc>
         <w:tc>
           <w:tcPr>
-            <w:tcW w:w="1613" w:type="dxa"/>
+            <w:tcW w:w="1595" w:type="dxa"/>
           </w:tcPr>
           <w:p>
             <w:pPr>
@@ -1173,7 +1165,7 @@
       <w:tr>
         <w:tc>
           <w:tcPr>
-            <w:tcW w:w="928" w:type="dxa"/>
+            <w:tcW w:w="986" w:type="dxa"/>
           </w:tcPr>
           <w:p>
             <w:pPr>
@@ -1200,7 +1192,7 @@
         </w:tc>
         <w:tc>
           <w:tcPr>
-            <w:tcW w:w="2140" w:type="dxa"/>
+            <w:tcW w:w="2129" w:type="dxa"/>
           </w:tcPr>
           <w:p>
             <w:pPr>
@@ -1220,7 +1212,7 @@
         </w:tc>
         <w:tc>
           <w:tcPr>
-            <w:tcW w:w="2237" w:type="dxa"/>
+            <w:tcW w:w="2222" w:type="dxa"/>
           </w:tcPr>
           <w:p>
             <w:pPr>
@@ -1240,55 +1232,27 @@
         </w:tc>
         <w:tc>
           <w:tcPr>
-            <w:tcW w:w="2098" w:type="dxa"/>
-          </w:tcPr>
-          <w:p>
-            <w:pPr>
-              <w:rPr>
-                <w:sz w:val="24"/>
-                <w:szCs w:val="24"/>
-              </w:rPr>
-            </w:pPr>
-            <w:r>
-              <w:rPr>
-                <w:sz w:val="24"/>
-                <w:szCs w:val="24"/>
-              </w:rPr>
-              <w:t>The servo should be at position</w:t>
-            </w:r>
-            <w:r>
-              <w:rPr>
-                <w:sz w:val="24"/>
-                <w:szCs w:val="24"/>
-              </w:rPr>
-              <w:t xml:space="preserve"> 0°</w:t>
-            </w:r>
-            <w:r>
-              <w:rPr>
-                <w:sz w:val="24"/>
-                <w:szCs w:val="24"/>
-              </w:rPr>
-              <w:t xml:space="preserve"> (off</w:t>
-            </w:r>
-            <w:r>
-              <w:rPr>
-                <w:sz w:val="24"/>
-                <w:szCs w:val="24"/>
-              </w:rPr>
-              <w:t>/ deactivated</w:t>
-            </w:r>
-            <w:r>
-              <w:rPr>
-                <w:sz w:val="24"/>
-                <w:szCs w:val="24"/>
-              </w:rPr>
-              <w:t>)</w:t>
-            </w:r>
-          </w:p>
-        </w:tc>
-        <w:tc>
-          <w:tcPr>
-            <w:tcW w:w="1613" w:type="dxa"/>
+            <w:tcW w:w="2084" w:type="dxa"/>
+          </w:tcPr>
+          <w:p>
+            <w:pPr>
+              <w:rPr>
+                <w:sz w:val="24"/>
+                <w:szCs w:val="24"/>
+              </w:rPr>
+            </w:pPr>
+            <w:r>
+              <w:rPr>
+                <w:sz w:val="24"/>
+                <w:szCs w:val="24"/>
+              </w:rPr>
+              <w:t>The servo should be at position 0° (off/ deactivated)</w:t>
+            </w:r>
+          </w:p>
+        </w:tc>
+        <w:tc>
+          <w:tcPr>
+            <w:tcW w:w="1595" w:type="dxa"/>
           </w:tcPr>
           <w:p>
             <w:pPr>
@@ -1303,7 +1267,7 @@
       <w:tr>
         <w:tc>
           <w:tcPr>
-            <w:tcW w:w="928" w:type="dxa"/>
+            <w:tcW w:w="986" w:type="dxa"/>
           </w:tcPr>
           <w:p>
             <w:pPr>
@@ -1323,7 +1287,7 @@
         </w:tc>
         <w:tc>
           <w:tcPr>
-            <w:tcW w:w="2140" w:type="dxa"/>
+            <w:tcW w:w="2129" w:type="dxa"/>
           </w:tcPr>
           <w:p>
             <w:pPr>
@@ -1343,7 +1307,7 @@
         </w:tc>
         <w:tc>
           <w:tcPr>
-            <w:tcW w:w="2237" w:type="dxa"/>
+            <w:tcW w:w="2222" w:type="dxa"/>
           </w:tcPr>
           <w:p>
             <w:pPr>
@@ -1363,7 +1327,7 @@
         </w:tc>
         <w:tc>
           <w:tcPr>
-            <w:tcW w:w="2098" w:type="dxa"/>
+            <w:tcW w:w="2084" w:type="dxa"/>
           </w:tcPr>
           <w:p>
             <w:pPr>
@@ -1383,7 +1347,7 @@
         </w:tc>
         <w:tc>
           <w:tcPr>
-            <w:tcW w:w="1613" w:type="dxa"/>
+            <w:tcW w:w="1595" w:type="dxa"/>
           </w:tcPr>
           <w:p>
             <w:pPr>
@@ -1398,7 +1362,7 @@
       <w:tr>
         <w:tc>
           <w:tcPr>
-            <w:tcW w:w="928" w:type="dxa"/>
+            <w:tcW w:w="986" w:type="dxa"/>
           </w:tcPr>
           <w:p>
             <w:pPr>
@@ -1418,7 +1382,7 @@
         </w:tc>
         <w:tc>
           <w:tcPr>
-            <w:tcW w:w="2140" w:type="dxa"/>
+            <w:tcW w:w="2129" w:type="dxa"/>
           </w:tcPr>
           <w:p>
             <w:pPr>
@@ -1438,7 +1402,7 @@
         </w:tc>
         <w:tc>
           <w:tcPr>
-            <w:tcW w:w="2237" w:type="dxa"/>
+            <w:tcW w:w="2222" w:type="dxa"/>
           </w:tcPr>
           <w:p>
             <w:pPr>
@@ -1465,7 +1429,7 @@
         </w:tc>
         <w:tc>
           <w:tcPr>
-            <w:tcW w:w="2098" w:type="dxa"/>
+            <w:tcW w:w="2084" w:type="dxa"/>
           </w:tcPr>
           <w:p>
             <w:pPr>
@@ -1485,7 +1449,439 @@
         </w:tc>
         <w:tc>
           <w:tcPr>
-            <w:tcW w:w="1613" w:type="dxa"/>
+            <w:tcW w:w="1595" w:type="dxa"/>
+          </w:tcPr>
+          <w:p>
+            <w:pPr>
+              <w:rPr>
+                <w:sz w:val="24"/>
+                <w:szCs w:val="24"/>
+              </w:rPr>
+            </w:pPr>
+          </w:p>
+        </w:tc>
+      </w:tr>
+      <w:tr>
+        <w:tc>
+          <w:tcPr>
+            <w:tcW w:w="9016" w:type="dxa"/>
+            <w:gridSpan w:val="5"/>
+            <w:shd w:val="clear" w:color="auto" w:fill="E7E6E6" w:themeFill="background2"/>
+          </w:tcPr>
+          <w:p>
+            <w:pPr>
+              <w:jc w:val="center"/>
+              <w:rPr>
+                <w:sz w:val="24"/>
+                <w:szCs w:val="24"/>
+              </w:rPr>
+            </w:pPr>
+            <w:r>
+              <w:rPr>
+                <w:sz w:val="24"/>
+                <w:szCs w:val="24"/>
+              </w:rPr>
+              <w:t>Node 3 – Alerting Node</w:t>
+            </w:r>
+          </w:p>
+        </w:tc>
+      </w:tr>
+      <w:tr>
+        <w:tc>
+          <w:tcPr>
+            <w:tcW w:w="986" w:type="dxa"/>
+          </w:tcPr>
+          <w:p>
+            <w:pPr>
+              <w:rPr>
+                <w:sz w:val="24"/>
+                <w:szCs w:val="24"/>
+              </w:rPr>
+            </w:pPr>
+            <w:r>
+              <w:rPr>
+                <w:sz w:val="24"/>
+                <w:szCs w:val="24"/>
+              </w:rPr>
+              <w:t>TC - 12</w:t>
+            </w:r>
+          </w:p>
+        </w:tc>
+        <w:tc>
+          <w:tcPr>
+            <w:tcW w:w="2129" w:type="dxa"/>
+          </w:tcPr>
+          <w:p>
+            <w:pPr>
+              <w:rPr>
+                <w:sz w:val="24"/>
+                <w:szCs w:val="24"/>
+              </w:rPr>
+            </w:pPr>
+            <w:r>
+              <w:rPr>
+                <w:sz w:val="24"/>
+                <w:szCs w:val="24"/>
+              </w:rPr>
+              <w:t>I2C LCD Display</w:t>
+            </w:r>
+          </w:p>
+        </w:tc>
+        <w:tc>
+          <w:tcPr>
+            <w:tcW w:w="2222" w:type="dxa"/>
+          </w:tcPr>
+          <w:p>
+            <w:pPr>
+              <w:rPr>
+                <w:sz w:val="24"/>
+                <w:szCs w:val="24"/>
+              </w:rPr>
+            </w:pPr>
+            <w:r>
+              <w:rPr>
+                <w:sz w:val="24"/>
+                <w:szCs w:val="24"/>
+              </w:rPr>
+              <w:t>Initialise the display and write “A.E.R.O” to row 0</w:t>
+            </w:r>
+          </w:p>
+        </w:tc>
+        <w:tc>
+          <w:tcPr>
+            <w:tcW w:w="2084" w:type="dxa"/>
+          </w:tcPr>
+          <w:p>
+            <w:pPr>
+              <w:rPr>
+                <w:sz w:val="24"/>
+                <w:szCs w:val="24"/>
+              </w:rPr>
+            </w:pPr>
+            <w:r>
+              <w:rPr>
+                <w:sz w:val="24"/>
+                <w:szCs w:val="24"/>
+              </w:rPr>
+              <w:t>The display clearly renders the text without corruption</w:t>
+            </w:r>
+          </w:p>
+        </w:tc>
+        <w:tc>
+          <w:tcPr>
+            <w:tcW w:w="1595" w:type="dxa"/>
+          </w:tcPr>
+          <w:p>
+            <w:pPr>
+              <w:rPr>
+                <w:sz w:val="24"/>
+                <w:szCs w:val="24"/>
+              </w:rPr>
+            </w:pPr>
+          </w:p>
+        </w:tc>
+      </w:tr>
+      <w:tr>
+        <w:tc>
+          <w:tcPr>
+            <w:tcW w:w="986" w:type="dxa"/>
+          </w:tcPr>
+          <w:p>
+            <w:pPr>
+              <w:rPr>
+                <w:sz w:val="24"/>
+                <w:szCs w:val="24"/>
+              </w:rPr>
+            </w:pPr>
+            <w:r>
+              <w:rPr>
+                <w:sz w:val="24"/>
+                <w:szCs w:val="24"/>
+              </w:rPr>
+              <w:t>TC - 13</w:t>
+            </w:r>
+          </w:p>
+        </w:tc>
+        <w:tc>
+          <w:tcPr>
+            <w:tcW w:w="2129" w:type="dxa"/>
+          </w:tcPr>
+          <w:p>
+            <w:pPr>
+              <w:rPr>
+                <w:sz w:val="24"/>
+                <w:szCs w:val="24"/>
+              </w:rPr>
+            </w:pPr>
+            <w:r>
+              <w:rPr>
+                <w:sz w:val="24"/>
+                <w:szCs w:val="24"/>
+              </w:rPr>
+              <w:t xml:space="preserve">Buzzer </w:t>
+            </w:r>
+          </w:p>
+        </w:tc>
+        <w:tc>
+          <w:tcPr>
+            <w:tcW w:w="2222" w:type="dxa"/>
+          </w:tcPr>
+          <w:p>
+            <w:pPr>
+              <w:rPr>
+                <w:sz w:val="24"/>
+                <w:szCs w:val="24"/>
+              </w:rPr>
+            </w:pPr>
+            <w:r>
+              <w:rPr>
+                <w:sz w:val="24"/>
+                <w:szCs w:val="24"/>
+              </w:rPr>
+              <w:t xml:space="preserve">Enable the alarm function </w:t>
+            </w:r>
+          </w:p>
+        </w:tc>
+        <w:tc>
+          <w:tcPr>
+            <w:tcW w:w="2084" w:type="dxa"/>
+          </w:tcPr>
+          <w:p>
+            <w:pPr>
+              <w:rPr>
+                <w:sz w:val="24"/>
+                <w:szCs w:val="24"/>
+              </w:rPr>
+            </w:pPr>
+            <w:r>
+              <w:rPr>
+                <w:sz w:val="24"/>
+                <w:szCs w:val="24"/>
+              </w:rPr>
+              <w:t>The buzzer should generate loud alarm sounds</w:t>
+            </w:r>
+          </w:p>
+        </w:tc>
+        <w:tc>
+          <w:tcPr>
+            <w:tcW w:w="1595" w:type="dxa"/>
+          </w:tcPr>
+          <w:p>
+            <w:pPr>
+              <w:rPr>
+                <w:sz w:val="24"/>
+                <w:szCs w:val="24"/>
+              </w:rPr>
+            </w:pPr>
+          </w:p>
+        </w:tc>
+      </w:tr>
+      <w:tr>
+        <w:tc>
+          <w:tcPr>
+            <w:tcW w:w="986" w:type="dxa"/>
+          </w:tcPr>
+          <w:p>
+            <w:pPr>
+              <w:rPr>
+                <w:sz w:val="24"/>
+                <w:szCs w:val="24"/>
+              </w:rPr>
+            </w:pPr>
+            <w:r>
+              <w:rPr>
+                <w:sz w:val="24"/>
+                <w:szCs w:val="24"/>
+              </w:rPr>
+              <w:t>TC - 14</w:t>
+            </w:r>
+          </w:p>
+        </w:tc>
+        <w:tc>
+          <w:tcPr>
+            <w:tcW w:w="2129" w:type="dxa"/>
+          </w:tcPr>
+          <w:p>
+            <w:pPr>
+              <w:rPr>
+                <w:sz w:val="24"/>
+                <w:szCs w:val="24"/>
+              </w:rPr>
+            </w:pPr>
+            <w:r>
+              <w:rPr>
+                <w:sz w:val="24"/>
+                <w:szCs w:val="24"/>
+              </w:rPr>
+              <w:t>LEDs (Status indicators)</w:t>
+            </w:r>
+          </w:p>
+        </w:tc>
+        <w:tc>
+          <w:tcPr>
+            <w:tcW w:w="2222" w:type="dxa"/>
+          </w:tcPr>
+          <w:p>
+            <w:pPr>
+              <w:rPr>
+                <w:sz w:val="24"/>
+                <w:szCs w:val="24"/>
+              </w:rPr>
+            </w:pPr>
+            <w:r>
+              <w:rPr>
+                <w:sz w:val="24"/>
+                <w:szCs w:val="24"/>
+              </w:rPr>
+              <w:t>Three steps:</w:t>
+            </w:r>
+            <w:r>
+              <w:rPr>
+                <w:sz w:val="24"/>
+                <w:szCs w:val="24"/>
+              </w:rPr>
+              <w:br/>
+              <w:t>• Activate the green LED pin HIGH, and both Yellow and red LED pins LOW</w:t>
+            </w:r>
+          </w:p>
+          <w:p>
+            <w:pPr>
+              <w:rPr>
+                <w:sz w:val="24"/>
+                <w:szCs w:val="24"/>
+              </w:rPr>
+            </w:pPr>
+            <w:r>
+              <w:rPr>
+                <w:sz w:val="24"/>
+                <w:szCs w:val="24"/>
+              </w:rPr>
+              <w:t xml:space="preserve">• </w:t>
+            </w:r>
+            <w:r>
+              <w:rPr>
+                <w:sz w:val="24"/>
+                <w:szCs w:val="24"/>
+              </w:rPr>
+              <w:t xml:space="preserve">Activate the </w:t>
+            </w:r>
+            <w:r>
+              <w:rPr>
+                <w:sz w:val="24"/>
+                <w:szCs w:val="24"/>
+              </w:rPr>
+              <w:t>yellow</w:t>
+            </w:r>
+            <w:r>
+              <w:rPr>
+                <w:sz w:val="24"/>
+                <w:szCs w:val="24"/>
+              </w:rPr>
+              <w:t xml:space="preserve"> LED pin HIGH, and both </w:t>
+            </w:r>
+            <w:r>
+              <w:rPr>
+                <w:sz w:val="24"/>
+                <w:szCs w:val="24"/>
+              </w:rPr>
+              <w:t>green</w:t>
+            </w:r>
+            <w:r>
+              <w:rPr>
+                <w:sz w:val="24"/>
+                <w:szCs w:val="24"/>
+              </w:rPr>
+              <w:t xml:space="preserve"> and </w:t>
+            </w:r>
+            <w:r>
+              <w:rPr>
+                <w:sz w:val="24"/>
+                <w:szCs w:val="24"/>
+              </w:rPr>
+              <w:t>red</w:t>
+            </w:r>
+            <w:r>
+              <w:rPr>
+                <w:sz w:val="24"/>
+                <w:szCs w:val="24"/>
+              </w:rPr>
+              <w:t xml:space="preserve"> LED pins LOW</w:t>
+            </w:r>
+          </w:p>
+          <w:p>
+            <w:pPr>
+              <w:rPr>
+                <w:sz w:val="24"/>
+                <w:szCs w:val="24"/>
+              </w:rPr>
+            </w:pPr>
+            <w:r>
+              <w:rPr>
+                <w:sz w:val="24"/>
+                <w:szCs w:val="24"/>
+              </w:rPr>
+              <w:t xml:space="preserve">• </w:t>
+            </w:r>
+            <w:r>
+              <w:rPr>
+                <w:sz w:val="24"/>
+                <w:szCs w:val="24"/>
+              </w:rPr>
+              <w:t xml:space="preserve">Activate the </w:t>
+            </w:r>
+            <w:r>
+              <w:rPr>
+                <w:sz w:val="24"/>
+                <w:szCs w:val="24"/>
+              </w:rPr>
+              <w:t>red</w:t>
+            </w:r>
+            <w:r>
+              <w:rPr>
+                <w:sz w:val="24"/>
+                <w:szCs w:val="24"/>
+              </w:rPr>
+              <w:t xml:space="preserve"> LED pin HIGH, and both green and </w:t>
+            </w:r>
+            <w:r>
+              <w:rPr>
+                <w:sz w:val="24"/>
+                <w:szCs w:val="24"/>
+              </w:rPr>
+              <w:t>yellow</w:t>
+            </w:r>
+            <w:r>
+              <w:rPr>
+                <w:sz w:val="24"/>
+                <w:szCs w:val="24"/>
+              </w:rPr>
+              <w:t xml:space="preserve"> LED pins LOW</w:t>
+            </w:r>
+          </w:p>
+        </w:tc>
+        <w:tc>
+          <w:tcPr>
+            <w:tcW w:w="2084" w:type="dxa"/>
+          </w:tcPr>
+          <w:p>
+            <w:pPr>
+              <w:rPr>
+                <w:sz w:val="24"/>
+                <w:szCs w:val="24"/>
+              </w:rPr>
+            </w:pPr>
+            <w:r>
+              <w:rPr>
+                <w:sz w:val="24"/>
+                <w:szCs w:val="24"/>
+              </w:rPr>
+              <w:t>The green LED turns on whilst yellow and red LEDs are off, then the yellow LED turns on whilst green and red LEDs are off, and finally the red LED turns on where the green and yellow LEDs turn off</w:t>
+            </w:r>
+          </w:p>
+        </w:tc>
+        <w:tc>
+          <w:tcPr>
+            <w:tcW w:w="1595" w:type="dxa"/>
           </w:tcPr>
           <w:p>
             <w:pPr>

</xml_diff>